<commit_message>
Add 2FA, doc previews, and doc-generation fixes
Introduce email-based two-factor authentication and related UI/endpoints (TwoFactorService, TwoFactorController, verify view, settings AJAX endpoints, OTP email sending + resend cooldown). Integrate 2FA into login flow (CustomAuthenticationSuccessHandler) and SecurityConfig, add user flags (twoFactorEnabled, emailVerified) to UserDtls. Surface applicant/admin document data (doc_0/doc_2) in multiple controllers and templates so request lists/details show course/position summaries. Harden position workflows to prevent status/doc edits on draft requests and merge admin form data with existing applicant data to avoid overwrites. Add dynamic table row expansion for research entries in DocumentGenerationService, and improve auto-draft JS (CSRF token fallback and icon/text tweaks) and minor template fixes for form selection behavior.
</commit_message>
<xml_diff>
--- a/HRCP-KKU-Academic/uploads/academic/1/doc_0.docx
+++ b/HRCP-KKU-Academic/uploads/academic/1/doc_0.docx
@@ -203,20 +203,202 @@
           <w:color w:val="000000" w:themeColor="text1"/>
           <w:sz w:val="32"/>
           <w:szCs w:val="32"/>
-          <w:lang w:eastAsia="en-GB"/>
+          <w:lang w:val="en-US" w:eastAsia="en-GB"/>
         </w:rPr>
       </w:pPr>
-      <w:proofErr w:type="spellStart"/>
-      <w:proofErr w:type="spellEnd"/>
-      <w:proofErr w:type="spellStart"/>
-      <w:proofErr w:type="spellEnd"/>
-      <w:r>
-        <w:rPr>
-          <w:rFonts w:ascii="TH Sarabun New" w:hAnsi="TH Sarabun New" w:cs="TH Sarabun New" w:eastAsia="TH Sarabun New"/>
-          <w:sz w:val="32"/>
-          <w:b w:val="on"/>
-        </w:rPr>
-        <w:t>ที่  อว 660301.26.8/3		          	วันที่5 มีนาคม 2569</w:t>
+      <w:r>
+        <w:rPr>
+          <w:rFonts w:ascii="TH Sarabun New" w:eastAsia="Times New Roman" w:hAnsi="TH Sarabun New" w:cs="TH Sarabun New"/>
+          <w:b/>
+          <w:bCs/>
+          <w:color w:val="000000" w:themeColor="text1"/>
+          <w:sz w:val="32"/>
+          <w:szCs w:val="32"/>
+          <w:cs/>
+          <w:lang w:eastAsia="en-GB"/>
+        </w:rPr>
+        <w:t>ที่</w:t>
+      </w:r>
+      <w:r>
+        <w:rPr>
+          <w:rFonts w:ascii="TH Sarabun New" w:eastAsia="Times New Roman" w:hAnsi="TH Sarabun New" w:cs="TH Sarabun New"/>
+          <w:color w:val="000000" w:themeColor="text1"/>
+          <w:sz w:val="32"/>
+          <w:szCs w:val="32"/>
+          <w:lang w:eastAsia="en-GB"/>
+        </w:rPr>
+        <w:t xml:space="preserve">  </w:t>
+      </w:r>
+      <w:r>
+        <w:rPr>
+          <w:rFonts w:ascii="TH Sarabun New" w:eastAsia="Times New Roman" w:hAnsi="TH Sarabun New" w:cs="TH Sarabun New"/>
+          <w:color w:val="000000" w:themeColor="text1"/>
+          <w:sz w:val="32"/>
+          <w:szCs w:val="32"/>
+          <w:cs/>
+          <w:lang w:eastAsia="en-GB"/>
+        </w:rPr>
+        <w:t xml:space="preserve">อว </w:t>
+      </w:r>
+      <w:r>
+        <w:rPr>
+          <w:rFonts w:ascii="TH Sarabun New" w:eastAsia="Times New Roman" w:hAnsi="TH Sarabun New" w:cs="TH Sarabun New"/>
+          <w:color w:val="000000" w:themeColor="text1"/>
+          <w:sz w:val="32"/>
+          <w:szCs w:val="32"/>
+          <w:lang w:eastAsia="en-GB"/>
+        </w:rPr>
+        <w:t>660301</w:t>
+      </w:r>
+      <w:r>
+        <w:rPr>
+          <w:rFonts w:ascii="TH Sarabun New" w:eastAsia="Times New Roman" w:hAnsi="TH Sarabun New" w:cs="TH Sarabun New"/>
+          <w:color w:val="000000" w:themeColor="text1"/>
+          <w:sz w:val="32"/>
+          <w:szCs w:val="32"/>
+          <w:cs/>
+          <w:lang w:eastAsia="en-GB"/>
+        </w:rPr>
+        <w:t>.</w:t>
+      </w:r>
+      <w:r>
+        <w:rPr>
+          <w:rFonts w:ascii="TH Sarabun New" w:eastAsia="Times New Roman" w:hAnsi="TH Sarabun New" w:cs="TH Sarabun New"/>
+          <w:color w:val="000000" w:themeColor="text1"/>
+          <w:sz w:val="32"/>
+          <w:szCs w:val="32"/>
+          <w:lang w:eastAsia="en-GB"/>
+        </w:rPr>
+        <w:t>26</w:t>
+      </w:r>
+      <w:r>
+        <w:rPr>
+          <w:rFonts w:ascii="TH Sarabun New" w:eastAsia="Times New Roman" w:hAnsi="TH Sarabun New" w:cs="TH Sarabun New"/>
+          <w:color w:val="000000" w:themeColor="text1"/>
+          <w:sz w:val="32"/>
+          <w:szCs w:val="32"/>
+          <w:cs/>
+          <w:lang w:eastAsia="en-GB"/>
+        </w:rPr>
+        <w:t>.</w:t>
+      </w:r>
+      <w:r>
+        <w:rPr>
+          <w:rFonts w:ascii="TH Sarabun New" w:eastAsia="Times New Roman" w:hAnsi="TH Sarabun New" w:cs="TH Sarabun New"/>
+          <w:color w:val="000000" w:themeColor="text1"/>
+          <w:sz w:val="32"/>
+          <w:szCs w:val="32"/>
+          <w:lang w:eastAsia="en-GB"/>
+        </w:rPr>
+        <w:t>8</w:t>
+      </w:r>
+      <w:r>
+        <w:rPr>
+          <w:rFonts w:ascii="TH Sarabun New" w:eastAsia="Times New Roman" w:hAnsi="TH Sarabun New" w:cs="TH Sarabun New"/>
+          <w:color w:val="000000" w:themeColor="text1"/>
+          <w:sz w:val="32"/>
+          <w:szCs w:val="32"/>
+          <w:cs/>
+          <w:lang w:eastAsia="en-GB"/>
+        </w:rPr>
+        <w:t>/</w:t>
+      </w:r>
+      <w:r>
+        <w:rPr>
+          <w:rFonts w:ascii="TH Sarabun New" w:eastAsia="Times New Roman" w:hAnsi="TH Sarabun New" w:cs="TH Sarabun New"/>
+          <w:color w:val="000000" w:themeColor="text1"/>
+          <w:sz w:val="32"/>
+          <w:szCs w:val="32"/>
+          <w:lang w:eastAsia="en-GB"/>
+        </w:rPr>
+        <w:t/>
+      </w:r>
+      <w:r>
+        <w:rPr>
+          <w:rFonts w:ascii="TH Sarabun New" w:eastAsia="Times New Roman" w:hAnsi="TH Sarabun New" w:cs="TH Sarabun New"/>
+          <w:color w:val="000000" w:themeColor="text1"/>
+          <w:sz w:val="32"/>
+          <w:szCs w:val="32"/>
+          <w:lang w:val="en-US" w:eastAsia="en-GB"/>
+        </w:rPr>
+        <w:t/>
+      </w:r>
+      <w:r>
+        <w:rPr>
+          <w:rFonts w:ascii="TH Sarabun New" w:eastAsia="Times New Roman" w:hAnsi="TH Sarabun New" w:cs="TH Sarabun New"/>
+          <w:color w:val="000000" w:themeColor="text1"/>
+          <w:sz w:val="32"/>
+          <w:szCs w:val="32"/>
+          <w:lang w:eastAsia="en-GB"/>
+        </w:rPr>
+        <w:t/>
+      </w:r>
+      <w:r>
+        <w:rPr>
+          <w:rFonts w:ascii="TH Sarabun New" w:eastAsia="Times New Roman" w:hAnsi="TH Sarabun New" w:cs="TH Sarabun New"/>
+          <w:color w:val="000000" w:themeColor="text1"/>
+          <w:sz w:val="32"/>
+          <w:szCs w:val="32"/>
+          <w:lang w:eastAsia="en-GB"/>
+        </w:rPr>
+        <w:tab/>
+      </w:r>
+      <w:r>
+        <w:rPr>
+          <w:rFonts w:ascii="TH Sarabun New" w:eastAsia="Times New Roman" w:hAnsi="TH Sarabun New" w:cs="TH Sarabun New"/>
+          <w:color w:val="000000" w:themeColor="text1"/>
+          <w:sz w:val="32"/>
+          <w:szCs w:val="32"/>
+          <w:lang w:eastAsia="en-GB"/>
+        </w:rPr>
+        <w:tab/>
+        <w:t xml:space="preserve">          </w:t>
+      </w:r>
+      <w:r>
+        <w:rPr>
+          <w:rFonts w:ascii="TH Sarabun New" w:eastAsia="Times New Roman" w:hAnsi="TH Sarabun New" w:cs="TH Sarabun New"/>
+          <w:color w:val="000000" w:themeColor="text1"/>
+          <w:sz w:val="32"/>
+          <w:szCs w:val="32"/>
+          <w:lang w:eastAsia="en-GB"/>
+        </w:rPr>
+        <w:tab/>
+      </w:r>
+      <w:r>
+        <w:rPr>
+          <w:rFonts w:ascii="TH Sarabun New" w:eastAsia="Times New Roman" w:hAnsi="TH Sarabun New" w:cs="TH Sarabun New"/>
+          <w:b/>
+          <w:bCs/>
+          <w:color w:val="000000" w:themeColor="text1"/>
+          <w:sz w:val="32"/>
+          <w:szCs w:val="32"/>
+          <w:cs/>
+          <w:lang w:eastAsia="en-GB"/>
+        </w:rPr>
+        <w:t>วันที่</w:t>
+      </w:r>
+      <w:r>
+        <w:rPr>
+          <w:rFonts w:ascii="TH Sarabun New" w:eastAsia="Times New Roman" w:hAnsi="TH Sarabun New" w:cs="TH Sarabun New" w:hint="cs"/>
+          <w:b/>
+          <w:bCs/>
+          <w:color w:val="000000" w:themeColor="text1"/>
+          <w:sz w:val="32"/>
+          <w:szCs w:val="32"/>
+          <w:cs/>
+          <w:lang w:eastAsia="en-GB"/>
+        </w:rPr>
+        <w:t xml:space="preserve"> </w:t>
+      </w:r>
+      <w:r>
+        <w:rPr>
+          <w:rFonts w:ascii="TH Sarabun New" w:eastAsia="Times New Roman" w:hAnsi="TH Sarabun New" w:cs="TH Sarabun New"/>
+          <w:color w:val="000000" w:themeColor="text1"/>
+          <w:sz w:val="32"/>
+          <w:szCs w:val="32"/>
+          <w:lang w:eastAsia="en-GB"/>
+        </w:rPr>
+        <w:t>19 มีนาคม 2569</w:t>
       </w:r>
     </w:p>
     <w:p>
@@ -227,6 +409,7 @@
           <w:color w:val="000000" w:themeColor="text1"/>
           <w:sz w:val="16"/>
           <w:szCs w:val="16"/>
+          <w:cs/>
           <w:lang w:eastAsia="en-GB"/>
         </w:rPr>
       </w:pPr>
@@ -374,21 +557,408 @@
           <w:lang w:val="en-US" w:eastAsia="en-GB"/>
         </w:rPr>
       </w:pPr>
-      <w:proofErr w:type="spellStart"/>
-      <w:proofErr w:type="spellEnd"/>
-      <w:proofErr w:type="spellStart"/>
-      <w:proofErr w:type="spellEnd"/>
-      <w:proofErr w:type="spellStart"/>
-      <w:proofErr w:type="spellEnd"/>
-      <w:proofErr w:type="spellStart"/>
-      <w:proofErr w:type="spellEnd"/>
-      <w:r>
-        <w:rPr>
-          <w:rFonts w:ascii="TH Sarabun New" w:hAnsi="TH Sarabun New" w:cs="TH Sarabun New" w:eastAsia="TH Sarabun New"/>
-          <w:sz w:val="32"/>
-          <w:b w:val="off"/>
-        </w:rPr>
-        <w:t xml:space="preserve">	ข้าพเจ้า นายApec พนักงานมหาวิทยาลัย ประเภท วิชาการ ตำแหน่ง อาจารย์ ปฏิบัติงานที่ สาขาวิชาวิทยาการคอมพิวเตอร์ สังกัด วิทยาลัยการคอมพิวเตอร์ มีความประสงค์ขอรับการประเมินการสอนจากคณะอนุกรรมการประเมินผลการสอน เพื่อประกอบการขอกำหนดตำแหน่งทางวิชาการระดับ [✓] ผู้ช่วยศาสตราจารย์  [{{chk2}}] รองศาสตราจารย์ [{{chk3}}] ศาสตราจารย์ พร้อมนี้ได้แนบเอกสารประกอบการขอประเมินผลการสอน จำนวน       3 ชุด ดังนี้</w:t>
+      <w:r>
+        <w:rPr>
+          <w:rFonts w:ascii="TH Sarabun New" w:eastAsia="Times New Roman" w:hAnsi="TH Sarabun New" w:cs="TH Sarabun New"/>
+          <w:color w:val="000000" w:themeColor="text1"/>
+          <w:sz w:val="32"/>
+          <w:szCs w:val="32"/>
+          <w:cs/>
+          <w:lang w:eastAsia="en-GB"/>
+        </w:rPr>
+        <w:tab/>
+      </w:r>
+      <w:r>
+        <w:rPr>
+          <w:rFonts w:ascii="TH Sarabun New" w:eastAsia="Times New Roman" w:hAnsi="TH Sarabun New" w:cs="TH Sarabun New" w:hint="cs"/>
+          <w:color w:val="000000" w:themeColor="text1"/>
+          <w:sz w:val="32"/>
+          <w:szCs w:val="32"/>
+          <w:cs/>
+          <w:lang w:eastAsia="en-GB"/>
+        </w:rPr>
+        <w:t>ข้าพเจ้า</w:t>
+      </w:r>
+      <w:r>
+        <w:rPr>
+          <w:rFonts w:ascii="TH Sarabun New" w:eastAsia="Times New Roman" w:hAnsi="TH Sarabun New" w:cs="TH Sarabun New"/>
+          <w:color w:val="000000" w:themeColor="text1"/>
+          <w:sz w:val="32"/>
+          <w:szCs w:val="32"/>
+          <w:lang w:eastAsia="en-GB"/>
+        </w:rPr>
+        <w:t xml:space="preserve"> </w:t>
+      </w:r>
+      <w:r>
+        <w:rPr>
+          <w:rFonts w:ascii="TH Sarabun New" w:eastAsia="Times New Roman" w:hAnsi="TH Sarabun New" w:cs="TH Sarabun New"/>
+          <w:color w:val="000000" w:themeColor="text1"/>
+          <w:sz w:val="32"/>
+          <w:szCs w:val="32"/>
+          <w:lang w:eastAsia="en-GB"/>
+        </w:rPr>
+        <w:t>Apec</w:t>
+      </w:r>
+      <w:r>
+        <w:rPr>
+          <w:rFonts w:ascii="TH Sarabun New" w:eastAsia="Times New Roman" w:hAnsi="TH Sarabun New" w:cs="TH Sarabun New"/>
+          <w:color w:val="000000" w:themeColor="text1"/>
+          <w:sz w:val="32"/>
+          <w:szCs w:val="32"/>
+          <w:lang w:val="en-US" w:eastAsia="en-GB"/>
+        </w:rPr>
+        <w:t/>
+      </w:r>
+      <w:r>
+        <w:rPr>
+          <w:rFonts w:ascii="TH Sarabun New" w:eastAsia="Times New Roman" w:hAnsi="TH Sarabun New" w:cs="TH Sarabun New"/>
+          <w:color w:val="000000" w:themeColor="text1"/>
+          <w:sz w:val="32"/>
+          <w:szCs w:val="32"/>
+          <w:lang w:eastAsia="en-GB"/>
+        </w:rPr>
+        <w:t/>
+      </w:r>
+      <w:r>
+        <w:rPr>
+          <w:rFonts w:ascii="TH Sarabun New" w:eastAsia="Times New Roman" w:hAnsi="TH Sarabun New" w:cs="TH Sarabun New"/>
+          <w:color w:val="000000" w:themeColor="text1"/>
+          <w:sz w:val="32"/>
+          <w:szCs w:val="32"/>
+          <w:lang w:eastAsia="en-GB"/>
+        </w:rPr>
+        <w:t/>
+      </w:r>
+      <w:r>
+        <w:rPr>
+          <w:rFonts w:ascii="TH Sarabun New" w:eastAsia="Times New Roman" w:hAnsi="TH Sarabun New" w:cs="TH Sarabun New"/>
+          <w:color w:val="000000" w:themeColor="text1"/>
+          <w:sz w:val="32"/>
+          <w:szCs w:val="32"/>
+          <w:lang w:eastAsia="en-GB"/>
+        </w:rPr>
+        <w:t/>
+      </w:r>
+      <w:r>
+        <w:rPr>
+          <w:rFonts w:ascii="TH Sarabun New" w:eastAsia="Times New Roman" w:hAnsi="TH Sarabun New" w:cs="TH Sarabun New" w:hint="cs"/>
+          <w:color w:val="000000" w:themeColor="text1"/>
+          <w:sz w:val="32"/>
+          <w:szCs w:val="32"/>
+          <w:cs/>
+          <w:lang w:eastAsia="en-GB"/>
+        </w:rPr>
+        <w:t xml:space="preserve"> </w:t>
+      </w:r>
+      <w:r>
+        <w:rPr>
+          <w:rFonts w:ascii="TH Sarabun New" w:eastAsia="Times New Roman" w:hAnsi="TH Sarabun New" w:cs="TH Sarabun New"/>
+          <w:color w:val="000000" w:themeColor="text1"/>
+          <w:sz w:val="32"/>
+          <w:szCs w:val="32"/>
+          <w:lang w:eastAsia="en-GB"/>
+        </w:rPr>
+        <w:t>{{employee_type}}</w:t>
+      </w:r>
+      <w:r>
+        <w:rPr>
+          <w:rFonts w:ascii="TH Sarabun New" w:eastAsia="Times New Roman" w:hAnsi="TH Sarabun New" w:cs="TH Sarabun New"/>
+          <w:color w:val="000000" w:themeColor="text1"/>
+          <w:sz w:val="32"/>
+          <w:szCs w:val="32"/>
+          <w:lang w:eastAsia="en-GB"/>
+        </w:rPr>
+        <w:t/>
+      </w:r>
+      <w:r>
+        <w:rPr>
+          <w:rFonts w:ascii="TH Sarabun New" w:eastAsia="Times New Roman" w:hAnsi="TH Sarabun New" w:cs="TH Sarabun New"/>
+          <w:color w:val="000000" w:themeColor="text1"/>
+          <w:sz w:val="32"/>
+          <w:szCs w:val="32"/>
+          <w:lang w:eastAsia="en-GB"/>
+        </w:rPr>
+        <w:t/>
+      </w:r>
+      <w:r>
+        <w:rPr>
+          <w:rFonts w:ascii="TH Sarabun New" w:eastAsia="Times New Roman" w:hAnsi="TH Sarabun New" w:cs="TH Sarabun New" w:hint="cs"/>
+          <w:color w:val="000000" w:themeColor="text1"/>
+          <w:sz w:val="32"/>
+          <w:szCs w:val="32"/>
+          <w:lang w:eastAsia="en-GB"/>
+        </w:rPr>
+        <w:t xml:space="preserve"> </w:t>
+      </w:r>
+      <w:r>
+        <w:rPr>
+          <w:rFonts w:ascii="TH Sarabun New" w:eastAsia="Times New Roman" w:hAnsi="TH Sarabun New" w:cs="TH Sarabun New" w:hint="cs"/>
+          <w:color w:val="000000" w:themeColor="text1"/>
+          <w:sz w:val="32"/>
+          <w:szCs w:val="32"/>
+          <w:cs/>
+          <w:lang w:eastAsia="en-GB"/>
+        </w:rPr>
+        <w:t>ประเภท</w:t>
+      </w:r>
+      <w:r>
+        <w:rPr>
+          <w:rFonts w:ascii="TH Sarabun New" w:eastAsia="Times New Roman" w:hAnsi="TH Sarabun New" w:cs="TH Sarabun New" w:hint="cs"/>
+          <w:color w:val="000000" w:themeColor="text1"/>
+          <w:sz w:val="32"/>
+          <w:szCs w:val="32"/>
+          <w:cs/>
+          <w:lang w:eastAsia="en-GB"/>
+        </w:rPr>
+        <w:t xml:space="preserve"> </w:t>
+      </w:r>
+      <w:r>
+        <w:rPr>
+          <w:rFonts w:ascii="TH Sarabun New" w:eastAsia="Times New Roman" w:hAnsi="TH Sarabun New" w:cs="TH Sarabun New" w:hint="cs"/>
+          <w:color w:val="000000" w:themeColor="text1"/>
+          <w:sz w:val="32"/>
+          <w:szCs w:val="32"/>
+          <w:cs/>
+          <w:lang w:eastAsia="en-GB"/>
+        </w:rPr>
+        <w:t xml:space="preserve">วิชาการ ตำแหน่ง </w:t>
+      </w:r>
+      <w:r>
+        <w:rPr>
+          <w:rFonts w:ascii="TH Sarabun New" w:eastAsia="Times New Roman" w:hAnsi="TH Sarabun New" w:cs="TH Sarabun New"/>
+          <w:color w:val="000000" w:themeColor="text1"/>
+          <w:sz w:val="32"/>
+          <w:szCs w:val="32"/>
+          <w:lang w:eastAsia="en-GB"/>
+        </w:rPr>
+        <w:t/>
+      </w:r>
+      <w:r>
+        <w:rPr>
+          <w:rFonts w:ascii="TH Sarabun New" w:eastAsia="Times New Roman" w:hAnsi="TH Sarabun New" w:cs="TH Sarabun New"/>
+          <w:color w:val="000000" w:themeColor="text1"/>
+          <w:sz w:val="32"/>
+          <w:szCs w:val="32"/>
+          <w:lang w:eastAsia="en-GB"/>
+        </w:rPr>
+        <w:t/>
+      </w:r>
+      <w:r>
+        <w:rPr>
+          <w:rFonts w:ascii="TH Sarabun New" w:eastAsia="Times New Roman" w:hAnsi="TH Sarabun New" w:cs="TH Sarabun New"/>
+          <w:color w:val="000000" w:themeColor="text1"/>
+          <w:sz w:val="32"/>
+          <w:szCs w:val="32"/>
+          <w:lang w:eastAsia="en-GB"/>
+        </w:rPr>
+        <w:t/>
+      </w:r>
+      <w:r>
+        <w:rPr>
+          <w:rFonts w:ascii="TH Sarabun New" w:eastAsia="Times New Roman" w:hAnsi="TH Sarabun New" w:cs="TH Sarabun New" w:hint="cs"/>
+          <w:color w:val="000000" w:themeColor="text1"/>
+          <w:sz w:val="32"/>
+          <w:szCs w:val="32"/>
+          <w:cs/>
+          <w:lang w:eastAsia="en-GB"/>
+        </w:rPr>
+        <w:t xml:space="preserve"> ปฏิบัติงานที่ สาขาวิชาวิทยาการคอมพิวเตอร์ สังกัด วิทยาลัยการคอมพิวเตอร์ มีความประสงค์ขอรับการประเมินการสอนจากคณะอนุกรรมการประเมินผลการสอน เพื่อประกอบการขอกำหนดตำแหน่งทางวิชาการระดับ </w:t>
+      </w:r>
+      <w:r>
+        <w:rPr>
+          <w:rFonts w:ascii="TH Sarabun New" w:eastAsia="Times New Roman" w:hAnsi="TH Sarabun New" w:cs="TH Sarabun New"/>
+          <w:color w:val="000000" w:themeColor="text1"/>
+          <w:sz w:val="32"/>
+          <w:szCs w:val="32"/>
+          <w:lang w:val="en-US" w:eastAsia="en-GB"/>
+        </w:rPr>
+        <w:t>[</w:t>
+      </w:r>
+      <w:r>
+        <w:rPr>
+          <w:rFonts w:ascii="TH Sarabun New" w:eastAsia="Times New Roman" w:hAnsi="TH Sarabun New" w:cs="TH Sarabun New"/>
+          <w:color w:val="000000" w:themeColor="text1"/>
+          <w:sz w:val="32"/>
+          <w:szCs w:val="32"/>
+          <w:lang w:val="en-US" w:eastAsia="en-GB"/>
+        </w:rPr>
+        <w:t>✓</w:t>
+      </w:r>
+      <w:r>
+        <w:rPr>
+          <w:rFonts w:ascii="TH Sarabun New" w:eastAsia="Times New Roman" w:hAnsi="TH Sarabun New" w:cs="TH Sarabun New"/>
+          <w:color w:val="000000" w:themeColor="text1"/>
+          <w:sz w:val="32"/>
+          <w:szCs w:val="32"/>
+          <w:lang w:val="en-US" w:eastAsia="en-GB"/>
+        </w:rPr>
+        <w:t xml:space="preserve">] </w:t>
+      </w:r>
+      <w:r>
+        <w:rPr>
+          <w:rFonts w:ascii="TH Sarabun New" w:eastAsia="Times New Roman" w:hAnsi="TH Sarabun New" w:cs="TH Sarabun New" w:hint="cs"/>
+          <w:color w:val="000000" w:themeColor="text1"/>
+          <w:sz w:val="32"/>
+          <w:szCs w:val="32"/>
+          <w:cs/>
+          <w:lang w:val="en-US" w:eastAsia="en-GB"/>
+        </w:rPr>
+        <w:t xml:space="preserve">ผู้ช่วยศาสตราจารย์ </w:t>
+      </w:r>
+      <w:r>
+        <w:rPr>
+          <w:rFonts w:ascii="TH Sarabun New" w:eastAsia="Times New Roman" w:hAnsi="TH Sarabun New" w:cs="TH Sarabun New"/>
+          <w:color w:val="000000" w:themeColor="text1"/>
+          <w:sz w:val="32"/>
+          <w:szCs w:val="32"/>
+          <w:lang w:val="en-US" w:eastAsia="en-GB"/>
+        </w:rPr>
+        <w:t>[</w:t>
+      </w:r>
+      <w:r>
+        <w:rPr>
+          <w:rFonts w:ascii="TH Sarabun New" w:eastAsia="Times New Roman" w:hAnsi="TH Sarabun New" w:cs="TH Sarabun New"/>
+          <w:color w:val="000000" w:themeColor="text1"/>
+          <w:sz w:val="32"/>
+          <w:szCs w:val="32"/>
+          <w:lang w:val="en-US" w:eastAsia="en-GB"/>
+        </w:rPr>
+        <w:t> </w:t>
+      </w:r>
+      <w:r>
+        <w:rPr>
+          <w:rFonts w:ascii="TH Sarabun New" w:eastAsia="Times New Roman" w:hAnsi="TH Sarabun New" w:cs="TH Sarabun New"/>
+          <w:color w:val="000000" w:themeColor="text1"/>
+          <w:sz w:val="32"/>
+          <w:szCs w:val="32"/>
+          <w:lang w:val="en-US" w:eastAsia="en-GB"/>
+        </w:rPr>
+        <w:t/>
+      </w:r>
+      <w:r>
+        <w:rPr>
+          <w:rFonts w:ascii="TH Sarabun New" w:eastAsia="Times New Roman" w:hAnsi="TH Sarabun New" w:cs="TH Sarabun New"/>
+          <w:color w:val="000000" w:themeColor="text1"/>
+          <w:sz w:val="32"/>
+          <w:szCs w:val="32"/>
+          <w:lang w:val="en-US" w:eastAsia="en-GB"/>
+        </w:rPr>
+        <w:t/>
+      </w:r>
+      <w:r>
+        <w:rPr>
+          <w:rFonts w:ascii="TH Sarabun New" w:eastAsia="Times New Roman" w:hAnsi="TH Sarabun New" w:cs="TH Sarabun New"/>
+          <w:color w:val="000000" w:themeColor="text1"/>
+          <w:sz w:val="32"/>
+          <w:szCs w:val="32"/>
+          <w:lang w:val="en-US" w:eastAsia="en-GB"/>
+        </w:rPr>
+        <w:t xml:space="preserve">] </w:t>
+      </w:r>
+      <w:r>
+        <w:rPr>
+          <w:rFonts w:ascii="TH Sarabun New" w:eastAsia="Times New Roman" w:hAnsi="TH Sarabun New" w:cs="TH Sarabun New" w:hint="cs"/>
+          <w:color w:val="000000" w:themeColor="text1"/>
+          <w:sz w:val="32"/>
+          <w:szCs w:val="32"/>
+          <w:cs/>
+          <w:lang w:val="en-US" w:eastAsia="en-GB"/>
+        </w:rPr>
+        <w:t xml:space="preserve">รองศาสตราจารย์ </w:t>
+      </w:r>
+      <w:r>
+        <w:rPr>
+          <w:rFonts w:ascii="TH Sarabun New" w:eastAsia="Times New Roman" w:hAnsi="TH Sarabun New" w:cs="TH Sarabun New"/>
+          <w:color w:val="000000" w:themeColor="text1"/>
+          <w:sz w:val="32"/>
+          <w:szCs w:val="32"/>
+          <w:lang w:val="en-US" w:eastAsia="en-GB"/>
+        </w:rPr>
+        <w:t>[</w:t>
+      </w:r>
+      <w:r>
+        <w:rPr>
+          <w:rFonts w:ascii="TH Sarabun New" w:eastAsia="Times New Roman" w:hAnsi="TH Sarabun New" w:cs="TH Sarabun New"/>
+          <w:color w:val="000000" w:themeColor="text1"/>
+          <w:sz w:val="32"/>
+          <w:szCs w:val="32"/>
+          <w:lang w:val="en-US" w:eastAsia="en-GB"/>
+        </w:rPr>
+        <w:t> </w:t>
+      </w:r>
+      <w:r>
+        <w:rPr>
+          <w:rFonts w:ascii="TH Sarabun New" w:eastAsia="Times New Roman" w:hAnsi="TH Sarabun New" w:cs="TH Sarabun New"/>
+          <w:color w:val="000000" w:themeColor="text1"/>
+          <w:sz w:val="32"/>
+          <w:szCs w:val="32"/>
+          <w:lang w:val="en-US" w:eastAsia="en-GB"/>
+        </w:rPr>
+        <w:t/>
+      </w:r>
+      <w:r>
+        <w:rPr>
+          <w:rFonts w:ascii="TH Sarabun New" w:eastAsia="Times New Roman" w:hAnsi="TH Sarabun New" w:cs="TH Sarabun New"/>
+          <w:color w:val="000000" w:themeColor="text1"/>
+          <w:sz w:val="32"/>
+          <w:szCs w:val="32"/>
+          <w:lang w:val="en-US" w:eastAsia="en-GB"/>
+        </w:rPr>
+        <w:t/>
+      </w:r>
+      <w:r>
+        <w:rPr>
+          <w:rFonts w:ascii="TH Sarabun New" w:eastAsia="Times New Roman" w:hAnsi="TH Sarabun New" w:cs="TH Sarabun New"/>
+          <w:color w:val="000000" w:themeColor="text1"/>
+          <w:sz w:val="32"/>
+          <w:szCs w:val="32"/>
+          <w:lang w:val="en-US" w:eastAsia="en-GB"/>
+        </w:rPr>
+        <w:t xml:space="preserve">] </w:t>
+      </w:r>
+      <w:r>
+        <w:rPr>
+          <w:rFonts w:ascii="TH Sarabun New" w:eastAsia="Times New Roman" w:hAnsi="TH Sarabun New" w:cs="TH Sarabun New" w:hint="cs"/>
+          <w:color w:val="000000" w:themeColor="text1"/>
+          <w:sz w:val="32"/>
+          <w:szCs w:val="32"/>
+          <w:cs/>
+          <w:lang w:val="en-US" w:eastAsia="en-GB"/>
+        </w:rPr>
+        <w:t xml:space="preserve">ศาสตราจารย์ </w:t>
+      </w:r>
+      <w:r>
+        <w:rPr>
+          <w:rFonts w:ascii="TH Sarabun New" w:eastAsia="Times New Roman" w:hAnsi="TH Sarabun New" w:cs="TH Sarabun New" w:hint="cs"/>
+          <w:color w:val="000000" w:themeColor="text1"/>
+          <w:sz w:val="32"/>
+          <w:szCs w:val="32"/>
+          <w:cs/>
+          <w:lang w:val="en-US" w:eastAsia="en-GB"/>
+        </w:rPr>
+        <w:t xml:space="preserve">พร้อมนี้ได้แนบเอกสารประกอบการขอประเมินผลการสอน จำนวน </w:t>
+      </w:r>
+      <w:r>
+        <w:rPr>
+          <w:rFonts w:ascii="TH Sarabun New" w:eastAsia="Times New Roman" w:hAnsi="TH Sarabun New" w:cs="TH Sarabun New" w:hint="cs"/>
+          <w:color w:val="000000" w:themeColor="text1"/>
+          <w:sz w:val="32"/>
+          <w:szCs w:val="32"/>
+          <w:cs/>
+          <w:lang w:val="en-US" w:eastAsia="en-GB"/>
+        </w:rPr>
+        <w:t xml:space="preserve">      </w:t>
+      </w:r>
+      <w:r>
+        <w:rPr>
+          <w:rFonts w:ascii="TH Sarabun New" w:eastAsia="Times New Roman" w:hAnsi="TH Sarabun New" w:cs="TH Sarabun New" w:hint="cs"/>
+          <w:color w:val="000000" w:themeColor="text1"/>
+          <w:sz w:val="32"/>
+          <w:szCs w:val="32"/>
+          <w:cs/>
+          <w:lang w:val="en-US" w:eastAsia="en-GB"/>
+        </w:rPr>
+        <w:t>3 ชุด ดังนี้</w:t>
       </w:r>
     </w:p>
     <w:p>
@@ -425,6 +995,190 @@
         </w:rPr>
         <w:t>1. แผนการสอน พร้อมเกณฑ์และวิธีวัดประเมินผลของผู้เรียน</w:t>
       </w:r>
+      <w:r>
+        <w:rPr>
+          <w:rFonts w:ascii="TH Sarabun New" w:eastAsia="Times New Roman" w:hAnsi="TH Sarabun New" w:cs="TH Sarabun New"/>
+          <w:color w:val="000000" w:themeColor="text1"/>
+          <w:sz w:val="32"/>
+          <w:szCs w:val="32"/>
+          <w:lang w:val="en-US" w:eastAsia="en-GB"/>
+        </w:rPr>
+        <w:t xml:space="preserve"> </w:t>
+      </w:r>
+      <w:r>
+        <w:rPr>
+          <w:rFonts w:ascii="TH Sarabun New" w:eastAsia="Times New Roman" w:hAnsi="TH Sarabun New" w:cs="TH Sarabun New" w:hint="cs"/>
+          <w:color w:val="000000" w:themeColor="text1"/>
+          <w:sz w:val="32"/>
+          <w:szCs w:val="32"/>
+          <w:cs/>
+          <w:lang w:val="en-US" w:eastAsia="en-GB"/>
+        </w:rPr>
+        <w:t>รายวิชา</w:t>
+      </w:r>
+      <w:r>
+        <w:rPr>
+          <w:rFonts w:ascii="TH Sarabun New" w:eastAsia="Times New Roman" w:hAnsi="TH Sarabun New" w:cs="TH Sarabun New"/>
+          <w:color w:val="000000" w:themeColor="text1"/>
+          <w:sz w:val="32"/>
+          <w:szCs w:val="32"/>
+          <w:lang w:val="en-US" w:eastAsia="en-GB"/>
+        </w:rPr>
+        <w:t xml:space="preserve"> </w:t>
+      </w:r>
+      <w:r>
+        <w:rPr>
+          <w:rFonts w:ascii="TH Sarabun New" w:eastAsia="Times New Roman" w:hAnsi="TH Sarabun New" w:cs="TH Sarabun New"/>
+          <w:color w:val="000000" w:themeColor="text1"/>
+          <w:sz w:val="32"/>
+          <w:szCs w:val="32"/>
+          <w:lang w:val="en-US" w:eastAsia="en-GB"/>
+        </w:rPr>
+        <w:t>wwswdw</w:t>
+      </w:r>
+      <w:r>
+        <w:rPr>
+          <w:rFonts w:ascii="TH Sarabun New" w:hAnsi="TH Sarabun New" w:cs="TH Sarabun New"/>
+          <w:color w:val="000000" w:themeColor="text1"/>
+          <w:sz w:val="32"/>
+          <w:szCs w:val="32"/>
+          <w:shd w:val="clear" w:color="auto" w:fill="FFFFFF"/>
+        </w:rPr>
+        <w:t/>
+      </w:r>
+      <w:r>
+        <w:rPr>
+          <w:rFonts w:ascii="TH Sarabun New" w:eastAsia="Times New Roman" w:hAnsi="TH Sarabun New" w:cs="TH Sarabun New"/>
+          <w:color w:val="000000" w:themeColor="text1"/>
+          <w:sz w:val="32"/>
+          <w:szCs w:val="32"/>
+          <w:lang w:val="en-US" w:eastAsia="en-GB"/>
+        </w:rPr>
+        <w:t/>
+      </w:r>
+      <w:r>
+        <w:rPr>
+          <w:rFonts w:ascii="TH Sarabun New" w:eastAsia="Times New Roman" w:hAnsi="TH Sarabun New" w:cs="TH Sarabun New"/>
+          <w:color w:val="000000" w:themeColor="text1"/>
+          <w:sz w:val="32"/>
+          <w:szCs w:val="32"/>
+          <w:lang w:val="en-US" w:eastAsia="en-GB"/>
+        </w:rPr>
+        <w:t xml:space="preserve"> </w:t>
+      </w:r>
+      <w:r>
+        <w:rPr>
+          <w:rFonts w:ascii="TH Sarabun New" w:eastAsia="Times New Roman" w:hAnsi="TH Sarabun New" w:cs="TH Sarabun New" w:hint="cs"/>
+          <w:color w:val="000000" w:themeColor="text1"/>
+          <w:sz w:val="32"/>
+          <w:szCs w:val="32"/>
+          <w:cs/>
+          <w:lang w:val="en-US" w:eastAsia="en-GB"/>
+        </w:rPr>
+        <w:t>รหัสวิชา</w:t>
+      </w:r>
+      <w:r>
+        <w:rPr>
+          <w:rFonts w:ascii="TH Sarabun New" w:eastAsia="Times New Roman" w:hAnsi="TH Sarabun New" w:cs="TH Sarabun New"/>
+          <w:color w:val="000000" w:themeColor="text1"/>
+          <w:sz w:val="32"/>
+          <w:szCs w:val="32"/>
+          <w:lang w:val="en-US" w:eastAsia="en-GB"/>
+        </w:rPr>
+        <w:t xml:space="preserve"> </w:t>
+      </w:r>
+      <w:r>
+        <w:rPr>
+          <w:rFonts w:ascii="TH Sarabun New" w:eastAsia="Times New Roman" w:hAnsi="TH Sarabun New" w:cs="TH Sarabun New"/>
+          <w:color w:val="000000" w:themeColor="text1"/>
+          <w:sz w:val="32"/>
+          <w:szCs w:val="32"/>
+          <w:lang w:val="en-US" w:eastAsia="en-GB"/>
+        </w:rPr>
+        <w:t>sssss</w:t>
+      </w:r>
+      <w:r>
+        <w:rPr>
+          <w:rFonts w:ascii="TH Sarabun New" w:hAnsi="TH Sarabun New" w:cs="TH Sarabun New"/>
+          <w:color w:val="000000" w:themeColor="text1"/>
+          <w:sz w:val="32"/>
+          <w:szCs w:val="32"/>
+          <w:shd w:val="clear" w:color="auto" w:fill="FFFFFF"/>
+        </w:rPr>
+        <w:t/>
+      </w:r>
+      <w:r>
+        <w:rPr>
+          <w:rFonts w:ascii="TH Sarabun New" w:eastAsia="Times New Roman" w:hAnsi="TH Sarabun New" w:cs="TH Sarabun New"/>
+          <w:color w:val="000000" w:themeColor="text1"/>
+          <w:sz w:val="32"/>
+          <w:szCs w:val="32"/>
+          <w:lang w:val="en-US" w:eastAsia="en-GB"/>
+        </w:rPr>
+        <w:t/>
+      </w:r>
+      <w:r>
+        <w:rPr>
+          <w:rFonts w:ascii="TH Sarabun New" w:eastAsia="Times New Roman" w:hAnsi="TH Sarabun New" w:cs="TH Sarabun New" w:hint="cs"/>
+          <w:color w:val="000000" w:themeColor="text1"/>
+          <w:sz w:val="32"/>
+          <w:szCs w:val="32"/>
+          <w:cs/>
+          <w:lang w:val="en-US" w:eastAsia="en-GB"/>
+        </w:rPr>
+        <w:t xml:space="preserve"> </w:t>
+      </w:r>
+      <w:r>
+        <w:rPr>
+          <w:rFonts w:ascii="TH Sarabun New" w:eastAsia="Times New Roman" w:hAnsi="TH Sarabun New" w:cs="TH Sarabun New" w:hint="cs"/>
+          <w:color w:val="000000" w:themeColor="text1"/>
+          <w:sz w:val="32"/>
+          <w:szCs w:val="32"/>
+          <w:cs/>
+          <w:lang w:val="en-US" w:eastAsia="en-GB"/>
+        </w:rPr>
+        <w:t>ปีการศึกษา</w:t>
+      </w:r>
+      <w:r>
+        <w:rPr>
+          <w:rFonts w:ascii="TH Sarabun New" w:eastAsia="Times New Roman" w:hAnsi="TH Sarabun New" w:cs="TH Sarabun New"/>
+          <w:color w:val="000000" w:themeColor="text1"/>
+          <w:sz w:val="32"/>
+          <w:szCs w:val="32"/>
+          <w:lang w:val="en-US" w:eastAsia="en-GB"/>
+        </w:rPr>
+        <w:t xml:space="preserve"> </w:t>
+      </w:r>
+      <w:r>
+        <w:rPr>
+          <w:rFonts w:ascii="TH Sarabun New" w:eastAsia="Times New Roman" w:hAnsi="TH Sarabun New" w:cs="TH Sarabun New"/>
+          <w:color w:val="000000" w:themeColor="text1"/>
+          <w:sz w:val="32"/>
+          <w:szCs w:val="32"/>
+          <w:lang w:val="en-US" w:eastAsia="en-GB"/>
+        </w:rPr>
+        <w:t>2333</w:t>
+      </w:r>
+      <w:r>
+        <w:rPr>
+          <w:rFonts w:ascii="TH Sarabun New" w:eastAsia="Times New Roman" w:hAnsi="TH Sarabun New" w:cs="TH Sarabun New"/>
+          <w:color w:val="000000" w:themeColor="text1"/>
+          <w:sz w:val="32"/>
+          <w:szCs w:val="32"/>
+          <w:lang w:eastAsia="en-GB"/>
+        </w:rPr>
+        <w:t/>
+      </w:r>
+      <w:r>
+        <w:rPr>
+          <w:rFonts w:ascii="TH Sarabun New" w:eastAsia="Times New Roman" w:hAnsi="TH Sarabun New" w:cs="TH Sarabun New"/>
+          <w:color w:val="000000" w:themeColor="text1"/>
+          <w:sz w:val="32"/>
+          <w:szCs w:val="32"/>
+          <w:lang w:val="en-US" w:eastAsia="en-GB"/>
+        </w:rPr>
+        <w:t/>
+      </w:r>
     </w:p>
     <w:p>
       <w:pPr>
@@ -460,6 +1214,191 @@
         </w:rPr>
         <w:t>2. สาระสำคัญของเนื้อหาวิชาประกอบการบรรยายหรือการจัดกิจกรรมการเรียนรู้</w:t>
       </w:r>
+      <w:r>
+        <w:rPr>
+          <w:rFonts w:ascii="TH Sarabun New" w:eastAsia="Times New Roman" w:hAnsi="TH Sarabun New" w:cs="TH Sarabun New"/>
+          <w:color w:val="000000" w:themeColor="text1"/>
+          <w:sz w:val="32"/>
+          <w:szCs w:val="32"/>
+          <w:lang w:val="en-US" w:eastAsia="en-GB"/>
+        </w:rPr>
+        <w:t xml:space="preserve"> </w:t>
+      </w:r>
+      <w:r>
+        <w:rPr>
+          <w:rFonts w:ascii="TH Sarabun New" w:eastAsia="Times New Roman" w:hAnsi="TH Sarabun New" w:cs="TH Sarabun New" w:hint="cs"/>
+          <w:color w:val="000000" w:themeColor="text1"/>
+          <w:sz w:val="32"/>
+          <w:szCs w:val="32"/>
+          <w:cs/>
+          <w:lang w:val="en-US" w:eastAsia="en-GB"/>
+        </w:rPr>
+        <w:t>รายวิชา</w:t>
+      </w:r>
+      <w:r>
+        <w:rPr>
+          <w:rFonts w:ascii="TH Sarabun New" w:eastAsia="Times New Roman" w:hAnsi="TH Sarabun New" w:cs="TH Sarabun New"/>
+          <w:color w:val="000000" w:themeColor="text1"/>
+          <w:sz w:val="32"/>
+          <w:szCs w:val="32"/>
+          <w:lang w:val="en-US" w:eastAsia="en-GB"/>
+        </w:rPr>
+        <w:t xml:space="preserve"> </w:t>
+      </w:r>
+      <w:r>
+        <w:rPr>
+          <w:rFonts w:ascii="TH Sarabun New" w:eastAsia="Times New Roman" w:hAnsi="TH Sarabun New" w:cs="TH Sarabun New"/>
+          <w:color w:val="000000" w:themeColor="text1"/>
+          <w:sz w:val="32"/>
+          <w:szCs w:val="32"/>
+          <w:lang w:val="en-US" w:eastAsia="en-GB"/>
+        </w:rPr>
+        <w:t>wwswdw</w:t>
+      </w:r>
+      <w:r>
+        <w:rPr>
+          <w:rFonts w:ascii="TH Sarabun New" w:hAnsi="TH Sarabun New" w:cs="TH Sarabun New"/>
+          <w:color w:val="000000" w:themeColor="text1"/>
+          <w:sz w:val="32"/>
+          <w:szCs w:val="32"/>
+          <w:shd w:val="clear" w:color="auto" w:fill="FFFFFF"/>
+        </w:rPr>
+        <w:t/>
+      </w:r>
+      <w:r>
+        <w:rPr>
+          <w:rFonts w:ascii="TH Sarabun New" w:eastAsia="Times New Roman" w:hAnsi="TH Sarabun New" w:cs="TH Sarabun New"/>
+          <w:color w:val="000000" w:themeColor="text1"/>
+          <w:sz w:val="32"/>
+          <w:szCs w:val="32"/>
+          <w:lang w:val="en-US" w:eastAsia="en-GB"/>
+        </w:rPr>
+        <w:t/>
+      </w:r>
+      <w:r>
+        <w:rPr>
+          <w:rFonts w:ascii="TH Sarabun New" w:eastAsia="Times New Roman" w:hAnsi="TH Sarabun New" w:cs="TH Sarabun New" w:hint="cs"/>
+          <w:color w:val="000000" w:themeColor="text1"/>
+          <w:sz w:val="32"/>
+          <w:szCs w:val="32"/>
+          <w:cs/>
+          <w:lang w:val="en-US" w:eastAsia="en-GB"/>
+        </w:rPr>
+        <w:t xml:space="preserve"> </w:t>
+      </w:r>
+      <w:r>
+        <w:rPr>
+          <w:rFonts w:ascii="TH Sarabun New" w:eastAsia="Times New Roman" w:hAnsi="TH Sarabun New" w:cs="TH Sarabun New" w:hint="cs"/>
+          <w:color w:val="000000" w:themeColor="text1"/>
+          <w:sz w:val="32"/>
+          <w:szCs w:val="32"/>
+          <w:cs/>
+          <w:lang w:val="en-US" w:eastAsia="en-GB"/>
+        </w:rPr>
+        <w:t>รหัสวิชา</w:t>
+      </w:r>
+      <w:r>
+        <w:rPr>
+          <w:rFonts w:ascii="TH Sarabun New" w:eastAsia="Times New Roman" w:hAnsi="TH Sarabun New" w:cs="TH Sarabun New" w:hint="cs"/>
+          <w:color w:val="000000" w:themeColor="text1"/>
+          <w:sz w:val="32"/>
+          <w:szCs w:val="32"/>
+          <w:cs/>
+          <w:lang w:val="en-US" w:eastAsia="en-GB"/>
+        </w:rPr>
+        <w:t xml:space="preserve"> </w:t>
+      </w:r>
+      <w:r>
+        <w:rPr>
+          <w:rFonts w:ascii="TH Sarabun New" w:eastAsia="Times New Roman" w:hAnsi="TH Sarabun New" w:cs="TH Sarabun New"/>
+          <w:color w:val="000000" w:themeColor="text1"/>
+          <w:sz w:val="32"/>
+          <w:szCs w:val="32"/>
+          <w:lang w:val="en-US" w:eastAsia="en-GB"/>
+        </w:rPr>
+        <w:t>sssss</w:t>
+      </w:r>
+      <w:r>
+        <w:rPr>
+          <w:rFonts w:ascii="TH Sarabun New" w:hAnsi="TH Sarabun New" w:cs="TH Sarabun New"/>
+          <w:color w:val="000000" w:themeColor="text1"/>
+          <w:sz w:val="32"/>
+          <w:szCs w:val="32"/>
+          <w:shd w:val="clear" w:color="auto" w:fill="FFFFFF"/>
+        </w:rPr>
+        <w:t/>
+      </w:r>
+      <w:r>
+        <w:rPr>
+          <w:rFonts w:ascii="TH Sarabun New" w:eastAsia="Times New Roman" w:hAnsi="TH Sarabun New" w:cs="TH Sarabun New"/>
+          <w:color w:val="000000" w:themeColor="text1"/>
+          <w:sz w:val="32"/>
+          <w:szCs w:val="32"/>
+          <w:lang w:val="en-US" w:eastAsia="en-GB"/>
+        </w:rPr>
+        <w:t/>
+      </w:r>
+      <w:r>
+        <w:rPr>
+          <w:rFonts w:ascii="TH Sarabun New" w:eastAsia="Times New Roman" w:hAnsi="TH Sarabun New" w:cs="TH Sarabun New"/>
+          <w:color w:val="000000" w:themeColor="text1"/>
+          <w:sz w:val="32"/>
+          <w:szCs w:val="32"/>
+          <w:lang w:val="en-US" w:eastAsia="en-GB"/>
+        </w:rPr>
+        <w:t xml:space="preserve"> </w:t>
+      </w:r>
+      <w:r>
+        <w:rPr>
+          <w:rFonts w:ascii="TH Sarabun New" w:eastAsia="Times New Roman" w:hAnsi="TH Sarabun New" w:cs="TH Sarabun New" w:hint="cs"/>
+          <w:color w:val="000000" w:themeColor="text1"/>
+          <w:sz w:val="32"/>
+          <w:szCs w:val="32"/>
+          <w:cs/>
+          <w:lang w:val="en-US" w:eastAsia="en-GB"/>
+        </w:rPr>
+        <w:t>ปีการศึกษา</w:t>
+      </w:r>
+      <w:r>
+        <w:rPr>
+          <w:rFonts w:ascii="TH Sarabun New" w:eastAsia="Times New Roman" w:hAnsi="TH Sarabun New" w:cs="TH Sarabun New"/>
+          <w:color w:val="000000" w:themeColor="text1"/>
+          <w:sz w:val="32"/>
+          <w:szCs w:val="32"/>
+          <w:lang w:val="en-US" w:eastAsia="en-GB"/>
+        </w:rPr>
+        <w:t xml:space="preserve"> </w:t>
+      </w:r>
+      <w:r>
+        <w:rPr>
+          <w:rFonts w:ascii="TH Sarabun New" w:eastAsia="Times New Roman" w:hAnsi="TH Sarabun New" w:cs="TH Sarabun New"/>
+          <w:color w:val="000000" w:themeColor="text1"/>
+          <w:sz w:val="32"/>
+          <w:szCs w:val="32"/>
+          <w:lang w:val="en-US" w:eastAsia="en-GB"/>
+        </w:rPr>
+        <w:t>2333</w:t>
+      </w:r>
+      <w:r>
+        <w:rPr>
+          <w:rFonts w:ascii="TH Sarabun New" w:eastAsia="Times New Roman" w:hAnsi="TH Sarabun New" w:cs="TH Sarabun New"/>
+          <w:color w:val="000000" w:themeColor="text1"/>
+          <w:sz w:val="32"/>
+          <w:szCs w:val="32"/>
+          <w:lang w:eastAsia="en-GB"/>
+        </w:rPr>
+        <w:t/>
+      </w:r>
+      <w:r>
+        <w:rPr>
+          <w:rFonts w:ascii="TH Sarabun New" w:eastAsia="Times New Roman" w:hAnsi="TH Sarabun New" w:cs="TH Sarabun New"/>
+          <w:color w:val="000000" w:themeColor="text1"/>
+          <w:sz w:val="32"/>
+          <w:szCs w:val="32"/>
+          <w:lang w:val="en-US" w:eastAsia="en-GB"/>
+        </w:rPr>
+        <w:t/>
+      </w:r>
     </w:p>
     <w:p>
       <w:pPr>
@@ -526,6 +1465,189 @@
           <w:lang w:val="en-US" w:eastAsia="en-GB"/>
         </w:rPr>
         <w:t>แบบดิจิทัลและอื่นๆ</w:t>
+      </w:r>
+      <w:r>
+        <w:rPr>
+          <w:rFonts w:ascii="TH Sarabun New" w:eastAsia="Times New Roman" w:hAnsi="TH Sarabun New" w:cs="TH Sarabun New"/>
+          <w:color w:val="000000" w:themeColor="text1"/>
+          <w:sz w:val="32"/>
+          <w:szCs w:val="32"/>
+          <w:lang w:val="en-US" w:eastAsia="en-GB"/>
+        </w:rPr>
+        <w:t xml:space="preserve"> </w:t>
+      </w:r>
+      <w:r>
+        <w:rPr>
+          <w:rFonts w:ascii="TH Sarabun New" w:eastAsia="Times New Roman" w:hAnsi="TH Sarabun New" w:cs="TH Sarabun New" w:hint="cs"/>
+          <w:color w:val="000000" w:themeColor="text1"/>
+          <w:sz w:val="32"/>
+          <w:szCs w:val="32"/>
+          <w:cs/>
+          <w:lang w:val="en-US" w:eastAsia="en-GB"/>
+        </w:rPr>
+        <w:t>รายวิชา</w:t>
+      </w:r>
+      <w:r>
+        <w:rPr>
+          <w:rFonts w:ascii="TH Sarabun New" w:eastAsia="Times New Roman" w:hAnsi="TH Sarabun New" w:cs="TH Sarabun New"/>
+          <w:color w:val="000000" w:themeColor="text1"/>
+          <w:sz w:val="32"/>
+          <w:szCs w:val="32"/>
+          <w:lang w:val="en-US" w:eastAsia="en-GB"/>
+        </w:rPr>
+        <w:t xml:space="preserve"> </w:t>
+      </w:r>
+      <w:r>
+        <w:rPr>
+          <w:rFonts w:ascii="TH Sarabun New" w:eastAsia="Times New Roman" w:hAnsi="TH Sarabun New" w:cs="TH Sarabun New"/>
+          <w:color w:val="000000" w:themeColor="text1"/>
+          <w:sz w:val="32"/>
+          <w:szCs w:val="32"/>
+          <w:lang w:val="en-US" w:eastAsia="en-GB"/>
+        </w:rPr>
+        <w:t>wwswdw</w:t>
+      </w:r>
+      <w:r>
+        <w:rPr>
+          <w:rFonts w:ascii="TH Sarabun New" w:hAnsi="TH Sarabun New" w:cs="TH Sarabun New"/>
+          <w:color w:val="000000" w:themeColor="text1"/>
+          <w:sz w:val="32"/>
+          <w:szCs w:val="32"/>
+          <w:shd w:val="clear" w:color="auto" w:fill="FFFFFF"/>
+        </w:rPr>
+        <w:t/>
+      </w:r>
+      <w:r>
+        <w:rPr>
+          <w:rFonts w:ascii="TH Sarabun New" w:eastAsia="Times New Roman" w:hAnsi="TH Sarabun New" w:cs="TH Sarabun New"/>
+          <w:color w:val="000000" w:themeColor="text1"/>
+          <w:sz w:val="32"/>
+          <w:szCs w:val="32"/>
+          <w:lang w:val="en-US" w:eastAsia="en-GB"/>
+        </w:rPr>
+        <w:t/>
+      </w:r>
+      <w:r>
+        <w:rPr>
+          <w:rFonts w:ascii="TH Sarabun New" w:eastAsia="Times New Roman" w:hAnsi="TH Sarabun New" w:cs="TH Sarabun New"/>
+          <w:color w:val="000000" w:themeColor="text1"/>
+          <w:sz w:val="32"/>
+          <w:szCs w:val="32"/>
+          <w:lang w:val="en-US" w:eastAsia="en-GB"/>
+        </w:rPr>
+        <w:t xml:space="preserve"> </w:t>
+      </w:r>
+      <w:r>
+        <w:rPr>
+          <w:rFonts w:ascii="TH Sarabun New" w:eastAsia="Times New Roman" w:hAnsi="TH Sarabun New" w:cs="TH Sarabun New" w:hint="cs"/>
+          <w:color w:val="000000" w:themeColor="text1"/>
+          <w:sz w:val="32"/>
+          <w:szCs w:val="32"/>
+          <w:cs/>
+          <w:lang w:val="en-US" w:eastAsia="en-GB"/>
+        </w:rPr>
+        <w:t>รหัสวิชา</w:t>
+      </w:r>
+      <w:r>
+        <w:rPr>
+          <w:rFonts w:ascii="TH Sarabun New" w:eastAsia="Times New Roman" w:hAnsi="TH Sarabun New" w:cs="TH Sarabun New"/>
+          <w:color w:val="000000" w:themeColor="text1"/>
+          <w:sz w:val="32"/>
+          <w:szCs w:val="32"/>
+          <w:lang w:val="en-US" w:eastAsia="en-GB"/>
+        </w:rPr>
+        <w:t xml:space="preserve"> </w:t>
+      </w:r>
+      <w:r>
+        <w:rPr>
+          <w:rFonts w:ascii="TH Sarabun New" w:eastAsia="Times New Roman" w:hAnsi="TH Sarabun New" w:cs="TH Sarabun New"/>
+          <w:color w:val="000000" w:themeColor="text1"/>
+          <w:sz w:val="32"/>
+          <w:szCs w:val="32"/>
+          <w:lang w:val="en-US" w:eastAsia="en-GB"/>
+        </w:rPr>
+        <w:t>sssss</w:t>
+      </w:r>
+      <w:r>
+        <w:rPr>
+          <w:rFonts w:ascii="TH Sarabun New" w:hAnsi="TH Sarabun New" w:cs="TH Sarabun New"/>
+          <w:color w:val="000000" w:themeColor="text1"/>
+          <w:sz w:val="32"/>
+          <w:szCs w:val="32"/>
+          <w:shd w:val="clear" w:color="auto" w:fill="FFFFFF"/>
+        </w:rPr>
+        <w:t/>
+      </w:r>
+      <w:r>
+        <w:rPr>
+          <w:rFonts w:ascii="TH Sarabun New" w:eastAsia="Times New Roman" w:hAnsi="TH Sarabun New" w:cs="TH Sarabun New"/>
+          <w:color w:val="000000" w:themeColor="text1"/>
+          <w:sz w:val="32"/>
+          <w:szCs w:val="32"/>
+          <w:lang w:val="en-US" w:eastAsia="en-GB"/>
+        </w:rPr>
+        <w:t/>
+      </w:r>
+      <w:r>
+        <w:rPr>
+          <w:rFonts w:ascii="TH Sarabun New" w:eastAsia="Times New Roman" w:hAnsi="TH Sarabun New" w:cs="TH Sarabun New"/>
+          <w:color w:val="000000" w:themeColor="text1"/>
+          <w:sz w:val="32"/>
+          <w:szCs w:val="32"/>
+          <w:lang w:val="en-US" w:eastAsia="en-GB"/>
+        </w:rPr>
+        <w:t xml:space="preserve"> </w:t>
+      </w:r>
+      <w:r>
+        <w:rPr>
+          <w:rFonts w:ascii="TH Sarabun New" w:eastAsia="Times New Roman" w:hAnsi="TH Sarabun New" w:cs="TH Sarabun New" w:hint="cs"/>
+          <w:color w:val="000000" w:themeColor="text1"/>
+          <w:sz w:val="32"/>
+          <w:szCs w:val="32"/>
+          <w:cs/>
+          <w:lang w:val="en-US" w:eastAsia="en-GB"/>
+        </w:rPr>
+        <w:t>ปีการศึกษา</w:t>
+      </w:r>
+      <w:r>
+        <w:rPr>
+          <w:rFonts w:ascii="TH Sarabun New" w:eastAsia="Times New Roman" w:hAnsi="TH Sarabun New" w:cs="TH Sarabun New"/>
+          <w:color w:val="000000" w:themeColor="text1"/>
+          <w:sz w:val="32"/>
+          <w:szCs w:val="32"/>
+          <w:lang w:val="en-US" w:eastAsia="en-GB"/>
+        </w:rPr>
+        <w:t xml:space="preserve"> </w:t>
+      </w:r>
+      <w:r>
+        <w:rPr>
+          <w:rFonts w:ascii="TH Sarabun New" w:eastAsia="Times New Roman" w:hAnsi="TH Sarabun New" w:cs="TH Sarabun New"/>
+          <w:color w:val="000000" w:themeColor="text1"/>
+          <w:sz w:val="32"/>
+          <w:szCs w:val="32"/>
+          <w:lang w:val="en-US" w:eastAsia="en-GB"/>
+        </w:rPr>
+        <w:t>2333</w:t>
+      </w:r>
+      <w:r>
+        <w:rPr>
+          <w:rFonts w:ascii="TH Sarabun New" w:eastAsia="Times New Roman" w:hAnsi="TH Sarabun New" w:cs="TH Sarabun New"/>
+          <w:color w:val="000000" w:themeColor="text1"/>
+          <w:sz w:val="32"/>
+          <w:szCs w:val="32"/>
+          <w:lang w:eastAsia="en-GB"/>
+        </w:rPr>
+        <w:t/>
+      </w:r>
+      <w:r>
+        <w:rPr>
+          <w:rFonts w:ascii="TH Sarabun New" w:eastAsia="Times New Roman" w:hAnsi="TH Sarabun New" w:cs="TH Sarabun New"/>
+          <w:color w:val="000000" w:themeColor="text1"/>
+          <w:sz w:val="32"/>
+          <w:szCs w:val="32"/>
+          <w:lang w:val="en-US" w:eastAsia="en-GB"/>
+        </w:rPr>
+        <w:t/>
       </w:r>
     </w:p>
     <w:p>
@@ -700,15 +1822,78 @@
           <w:lang w:eastAsia="en-GB"/>
         </w:rPr>
       </w:pPr>
-      <w:proofErr w:type="spellStart"/>
-      <w:proofErr w:type="spellEnd"/>
-      <w:r>
-        <w:rPr>
-          <w:rFonts w:ascii="TH Sarabun New" w:hAnsi="TH Sarabun New" w:cs="TH Sarabun New" w:eastAsia="TH Sarabun New"/>
-          <w:sz w:val="32"/>
-          <w:b w:val="off"/>
-        </w:rPr>
-        <w:t xml:space="preserve">      (qwwqerr)</w:t>
+      <w:r>
+        <w:rPr>
+          <w:rFonts w:ascii="TH Sarabun New" w:eastAsia="Times New Roman" w:hAnsi="TH Sarabun New" w:cs="TH Sarabun New" w:hint="cs"/>
+          <w:color w:val="000000" w:themeColor="text1"/>
+          <w:sz w:val="32"/>
+          <w:szCs w:val="32"/>
+          <w:cs/>
+          <w:lang w:eastAsia="en-GB"/>
+        </w:rPr>
+        <w:t xml:space="preserve">      </w:t>
+      </w:r>
+      <w:r>
+        <w:rPr>
+          <w:rFonts w:ascii="TH Sarabun New" w:eastAsia="Times New Roman" w:hAnsi="TH Sarabun New" w:cs="TH Sarabun New" w:hint="cs"/>
+          <w:color w:val="000000" w:themeColor="text1"/>
+          <w:sz w:val="32"/>
+          <w:szCs w:val="32"/>
+          <w:cs/>
+          <w:lang w:eastAsia="en-GB"/>
+        </w:rPr>
+        <w:t>(</w:t>
+      </w:r>
+      <w:r>
+        <w:rPr>
+          <w:rFonts w:ascii="TH Sarabun New" w:eastAsia="Times New Roman" w:hAnsi="TH Sarabun New" w:cs="TH Sarabun New"/>
+          <w:color w:val="000000" w:themeColor="text1"/>
+          <w:sz w:val="32"/>
+          <w:szCs w:val="32"/>
+          <w:lang w:eastAsia="en-GB"/>
+        </w:rPr>
+        <w:t/>
+      </w:r>
+      <w:r>
+        <w:rPr>
+          <w:rFonts w:ascii="TH Sarabun New" w:eastAsia="Times New Roman" w:hAnsi="TH Sarabun New" w:cs="TH Sarabun New"/>
+          <w:color w:val="000000" w:themeColor="text1"/>
+          <w:sz w:val="32"/>
+          <w:szCs w:val="32"/>
+          <w:lang w:val="en-US" w:eastAsia="en-GB"/>
+        </w:rPr>
+        <w:t/>
+      </w:r>
+      <w:r>
+        <w:rPr>
+          <w:rFonts w:ascii="TH Sarabun New" w:eastAsia="Times New Roman" w:hAnsi="TH Sarabun New" w:cs="TH Sarabun New"/>
+          <w:color w:val="000000" w:themeColor="text1"/>
+          <w:sz w:val="32"/>
+          <w:szCs w:val="32"/>
+          <w:lang w:eastAsia="en-GB"/>
+        </w:rPr>
+        <w:t/>
+      </w:r>
+      <w:r>
+        <w:rPr>
+          <w:rFonts w:ascii="TH Sarabun New" w:eastAsia="Times New Roman" w:hAnsi="TH Sarabun New" w:cs="TH Sarabun New"/>
+          <w:color w:val="000000" w:themeColor="text1"/>
+          <w:sz w:val="32"/>
+          <w:szCs w:val="32"/>
+          <w:lang w:eastAsia="en-GB"/>
+        </w:rPr>
+        <w:t>{{applicant_name}}</w:t>
+      </w:r>
+      <w:r>
+        <w:rPr>
+          <w:rFonts w:ascii="TH Sarabun New" w:eastAsia="Times New Roman" w:hAnsi="TH Sarabun New" w:cs="TH Sarabun New" w:hint="cs"/>
+          <w:color w:val="000000" w:themeColor="text1"/>
+          <w:sz w:val="32"/>
+          <w:szCs w:val="32"/>
+          <w:cs/>
+          <w:lang w:eastAsia="en-GB"/>
+        </w:rPr>
+        <w:t>)</w:t>
       </w:r>
     </w:p>
     <w:p>

</xml_diff>

<commit_message>
Add document preview UI and download handling
Introduce system-wide document preview and safer download flows. Controllers now use a PreviewResponseFactory to serve inline PDF/DOCX (with no-cache headers) and provide /document/{type}/download endpoints that auto-generate previews when no stored file exists. Services auto-fill placeholder document labels; DocumentGenerationService handles missing files gracefully. PositionDocumentRepository JPQL updated for draft ordering. Frontend: add doc_preview.js modal (standalone mode), .btn-doc-preview buttons across admin/applicant templates, and minor CSS tweaks. Add planning doc docs/PLAN-preview-buttons.md.
</commit_message>
<xml_diff>
--- a/HRCP-KKU-Academic/uploads/academic/1/doc_0.docx
+++ b/HRCP-KKU-Academic/uploads/academic/1/doc_0.docx
@@ -310,7 +310,7 @@
           <w:szCs w:val="32"/>
           <w:lang w:eastAsia="en-GB"/>
         </w:rPr>
-        <w:t/>
+        <w:t>1</w:t>
       </w:r>
       <w:r>
         <w:rPr>
@@ -397,7 +397,7 @@
           <w:szCs w:val="32"/>
           <w:lang w:eastAsia="en-GB"/>
         </w:rPr>
-        <w:t>7 สิงหาคม 2569</w:t>
+        <w:t>21 สิงหาคม 2569</w:t>
       </w:r>
     </w:p>
     <w:p>
@@ -586,7 +586,7 @@
           <w:szCs w:val="32"/>
           <w:lang w:eastAsia="en-GB"/>
         </w:rPr>
-        <w:t xml:space="preserve"> ผู้ช่วยศาสตราจารย์ปาณวัฒน์ จันทร์ทองหลาง</w:t>
+        <w:t xml:space="preserve"> นายสมชาย ใจดีวิชาการ</w:t>
       </w:r>
       <w:r>
         <w:rPr>
@@ -647,7 +647,7 @@
           <w:szCs w:val="32"/>
           <w:lang w:eastAsia="en-GB"/>
         </w:rPr>
-        <w:t>ข้าราชการ</w:t>
+        <w:t>พนักงานมหาวิทยาลัย</w:t>
       </w:r>
       <w:r>
         <w:rPr>
@@ -749,7 +749,7 @@
           <w:szCs w:val="32"/>
           <w:lang w:val="en-US" w:eastAsia="en-GB"/>
         </w:rPr>
-        <w:t>]</w:t>
+        <w:t>✓]</w:t>
       </w:r>
       <w:r>
         <w:rPr>
@@ -780,7 +780,7 @@
           <w:szCs w:val="32"/>
           <w:lang w:val="en-US" w:eastAsia="en-GB"/>
         </w:rPr>
-        <w:t>[✓]</w:t>
+        <w:t>[ ]</w:t>
       </w:r>
       <w:r>
         <w:rPr>
@@ -811,7 +811,7 @@
           <w:szCs w:val="32"/>
           <w:lang w:val="en-US" w:eastAsia="en-GB"/>
         </w:rPr>
-        <w:t>[]</w:t>
+        <w:t>[ ]</w:t>
       </w:r>
       <w:r>
         <w:rPr>
@@ -898,7 +898,7 @@
           <w:szCs w:val="32"/>
           <w:lang w:val="en-US" w:eastAsia="en-GB"/>
         </w:rPr>
-        <w:t xml:space="preserve"> com sci </w:t>
+        <w:t xml:space="preserve"> การคำนวณควอนตัม </w:t>
       </w:r>
       <w:r>
         <w:rPr>
@@ -939,7 +939,7 @@
           <w:szCs w:val="32"/>
           <w:lang w:val="en-US" w:eastAsia="en-GB"/>
         </w:rPr>
-        <w:t xml:space="preserve"> CP123456</w:t>
+        <w:t xml:space="preserve"> CP 256 256</w:t>
       </w:r>
       <w:r>
         <w:rPr>
@@ -1066,7 +1066,7 @@
           <w:szCs w:val="32"/>
           <w:lang w:val="en-US" w:eastAsia="en-GB"/>
         </w:rPr>
-        <w:t xml:space="preserve"> com sci</w:t>
+        <w:t xml:space="preserve"> การคำนวณควอนตัม</w:t>
       </w:r>
       <w:r>
         <w:rPr>
@@ -1107,7 +1107,7 @@
           <w:szCs w:val="32"/>
           <w:lang w:val="en-US" w:eastAsia="en-GB"/>
         </w:rPr>
-        <w:t>CP123456 </w:t>
+        <w:t>CP 256 256 </w:t>
       </w:r>
       <w:r>
         <w:rPr>
@@ -1255,7 +1255,7 @@
           <w:szCs w:val="32"/>
           <w:lang w:val="en-US" w:eastAsia="en-GB"/>
         </w:rPr>
-        <w:t xml:space="preserve"> com sci </w:t>
+        <w:t xml:space="preserve"> การคำนวณควอนตัม </w:t>
       </w:r>
       <w:r>
         <w:rPr>
@@ -1296,7 +1296,7 @@
           <w:szCs w:val="32"/>
           <w:lang w:val="en-US" w:eastAsia="en-GB"/>
         </w:rPr>
-        <w:t xml:space="preserve"> CP123456 </w:t>
+        <w:t xml:space="preserve"> CP 256 256 </w:t>
       </w:r>
       <w:r>
         <w:rPr>
@@ -1551,7 +1551,7 @@
           <w:szCs w:val="32"/>
           <w:lang w:eastAsia="en-GB"/>
         </w:rPr>
-        <w:t>ผู้ช่วยศาสตราจารย์</w:t>
+        <w:t>นาย</w:t>
       </w:r>
       <w:r>
         <w:rPr>
@@ -1581,7 +1581,7 @@
           <w:szCs w:val="32"/>
           <w:lang w:eastAsia="en-GB"/>
         </w:rPr>
-        <w:t>ปาณวัฒน์ จันทร์ทองหลาง</w:t>
+        <w:t>สมชาย ใจดีวิชาการ</w:t>
       </w:r>
       <w:r>
         <w:rPr>

</xml_diff>